<commit_message>
new logo + vsn text
</commit_message>
<xml_diff>
--- a/ref/report_ref.docx
+++ b/ref/report_ref.docx
@@ -1,16 +1,18 @@
 
 <file path=word/document.xml><?xml version="1.0" encoding="utf-8"?>
-<w:document xmlns:wpc="http://schemas.microsoft.com/office/word/2010/wordprocessingCanvas" xmlns:cx="http://schemas.microsoft.com/office/drawing/2014/chartex" xmlns:cx1="http://schemas.microsoft.com/office/drawing/2015/9/8/chartex" xmlns:cx2="http://schemas.microsoft.com/office/drawing/2015/10/21/chartex" xmlns:cx3="http://schemas.microsoft.com/office/drawing/2016/5/9/chartex" xmlns:cx4="http://schemas.microsoft.com/office/drawing/2016/5/10/chartex" xmlns:cx5="http://schemas.microsoft.com/office/drawing/2016/5/11/chartex" xmlns:cx6="http://schemas.microsoft.com/office/drawing/2016/5/12/chartex" xmlns:cx7="http://schemas.microsoft.com/office/drawing/2016/5/13/chartex" xmlns:cx8="http://schemas.microsoft.com/office/drawing/2016/5/14/chartex" xmlns:mc="http://schemas.openxmlformats.org/markup-compatibility/2006" xmlns:aink="http://schemas.microsoft.com/office/drawing/2016/ink" xmlns:am3d="http://schemas.microsoft.com/office/drawing/2017/model3d" xmlns:o="urn:schemas-microsoft-com:office:office" xmlns:r="http://schemas.openxmlformats.org/officeDocument/2006/relationships" xmlns:m="http://schemas.openxmlformats.org/officeDocument/2006/math" xmlns:v="urn:schemas-microsoft-com:vml" xmlns:wp14="http://schemas.microsoft.com/office/word/2010/wordprocessingDrawing" xmlns:wp="http://schemas.openxmlformats.org/drawingml/2006/wordprocessingDrawing" xmlns:w10="urn:schemas-microsoft-com:office:word" xmlns:w="http://schemas.openxmlformats.org/wordprocessingml/2006/main" xmlns:w14="http://schemas.microsoft.com/office/word/2010/wordml" xmlns:w15="http://schemas.microsoft.com/office/word/2012/wordml" xmlns:w16cex="http://schemas.microsoft.com/office/word/2018/wordml/cex" xmlns:w16cid="http://schemas.microsoft.com/office/word/2016/wordml/cid" xmlns:w16="http://schemas.microsoft.com/office/word/2018/wordml" xmlns:w16sdtdh="http://schemas.microsoft.com/office/word/2020/wordml/sdtdatahash" xmlns:w16se="http://schemas.microsoft.com/office/word/2015/wordml/symex" xmlns:wpg="http://schemas.microsoft.com/office/word/2010/wordprocessingGroup" xmlns:wpi="http://schemas.microsoft.com/office/word/2010/wordprocessingInk" xmlns:wne="http://schemas.microsoft.com/office/word/2006/wordml" xmlns:wps="http://schemas.microsoft.com/office/word/2010/wordprocessingShape" mc:Ignorable="w14 w15 w16se w16cid w16 w16cex w16sdtdh wp14">
+<w:document xmlns:wpc="http://schemas.microsoft.com/office/word/2010/wordprocessingCanvas" xmlns:cx="http://schemas.microsoft.com/office/drawing/2014/chartex" xmlns:cx1="http://schemas.microsoft.com/office/drawing/2015/9/8/chartex" xmlns:cx2="http://schemas.microsoft.com/office/drawing/2015/10/21/chartex" xmlns:cx3="http://schemas.microsoft.com/office/drawing/2016/5/9/chartex" xmlns:cx4="http://schemas.microsoft.com/office/drawing/2016/5/10/chartex" xmlns:cx5="http://schemas.microsoft.com/office/drawing/2016/5/11/chartex" xmlns:cx6="http://schemas.microsoft.com/office/drawing/2016/5/12/chartex" xmlns:cx7="http://schemas.microsoft.com/office/drawing/2016/5/13/chartex" xmlns:cx8="http://schemas.microsoft.com/office/drawing/2016/5/14/chartex" xmlns:mc="http://schemas.openxmlformats.org/markup-compatibility/2006" xmlns:aink="http://schemas.microsoft.com/office/drawing/2016/ink" xmlns:am3d="http://schemas.microsoft.com/office/drawing/2017/model3d" xmlns:o="urn:schemas-microsoft-com:office:office" xmlns:oel="http://schemas.microsoft.com/office/2019/extlst" xmlns:r="http://schemas.openxmlformats.org/officeDocument/2006/relationships" xmlns:m="http://schemas.openxmlformats.org/officeDocument/2006/math" xmlns:v="urn:schemas-microsoft-com:vml" xmlns:wp14="http://schemas.microsoft.com/office/word/2010/wordprocessingDrawing" xmlns:wp="http://schemas.openxmlformats.org/drawingml/2006/wordprocessingDrawing" xmlns:w10="urn:schemas-microsoft-com:office:word" xmlns:w="http://schemas.openxmlformats.org/wordprocessingml/2006/main" xmlns:w14="http://schemas.microsoft.com/office/word/2010/wordml" xmlns:w15="http://schemas.microsoft.com/office/word/2012/wordml" xmlns:w16cex="http://schemas.microsoft.com/office/word/2018/wordml/cex" xmlns:w16cid="http://schemas.microsoft.com/office/word/2016/wordml/cid" xmlns:w16="http://schemas.microsoft.com/office/word/2018/wordml" xmlns:w16du="http://schemas.microsoft.com/office/word/2023/wordml/word16du" xmlns:w16sdtdh="http://schemas.microsoft.com/office/word/2020/wordml/sdtdatahash" xmlns:w16sdtfl="http://schemas.microsoft.com/office/word/2024/wordml/sdtformatlock" xmlns:w16se="http://schemas.microsoft.com/office/word/2015/wordml/symex" xmlns:wpg="http://schemas.microsoft.com/office/word/2010/wordprocessingGroup" xmlns:wpi="http://schemas.microsoft.com/office/word/2010/wordprocessingInk" xmlns:wne="http://schemas.microsoft.com/office/word/2006/wordml" xmlns:wps="http://schemas.microsoft.com/office/word/2010/wordprocessingShape" mc:Ignorable="w14 w15 w16se w16cid w16 w16cex w16sdtdh w16sdtfl w16du wp14">
   <w:body>
     <w:p>
       <w:pPr>
         <w:pStyle w:val="Title"/>
         <w:rPr>
+          <w:rFonts w:ascii="Aptos" w:hAnsi="Aptos"/>
           <w:color w:val="365F91" w:themeColor="accent1" w:themeShade="BF"/>
         </w:rPr>
       </w:pPr>
       <w:r>
         <w:rPr>
+          <w:rFonts w:ascii="Aptos" w:hAnsi="Aptos"/>
           <w:color w:val="365F91" w:themeColor="accent1" w:themeShade="BF"/>
         </w:rPr>
         <w:t>MY TITLE</w:t>
@@ -19,14 +21,23 @@
     <w:p>
       <w:pPr>
         <w:pStyle w:val="BodyText"/>
+        <w:rPr>
+          <w:rFonts w:ascii="Aptos" w:hAnsi="Aptos"/>
+        </w:rPr>
       </w:pPr>
       <w:r>
+        <w:rPr>
+          <w:rFonts w:ascii="Aptos" w:hAnsi="Aptos"/>
+        </w:rPr>
         <w:t>July 1, 2020</w:t>
       </w:r>
     </w:p>
     <w:p>
       <w:pPr>
         <w:pStyle w:val="BodyText"/>
+        <w:rPr>
+          <w:rFonts w:ascii="Aptos" w:hAnsi="Aptos"/>
+        </w:rPr>
       </w:pPr>
     </w:p>
     <w:p>
@@ -36,8 +47,14 @@
           <w:ilvl w:val="0"/>
           <w:numId w:val="0"/>
         </w:numPr>
+        <w:rPr>
+          <w:rFonts w:ascii="Aptos" w:hAnsi="Aptos"/>
+        </w:rPr>
       </w:pPr>
       <w:r>
+        <w:rPr>
+          <w:rFonts w:ascii="Aptos" w:hAnsi="Aptos"/>
+        </w:rPr>
         <w:t>TOC Header</w:t>
       </w:r>
     </w:p>
@@ -45,6 +62,7 @@
       <w:pPr>
         <w:pStyle w:val="Heading1"/>
         <w:rPr>
+          <w:rFonts w:ascii="Aptos" w:hAnsi="Aptos"/>
           <w:color w:val="1F497D" w:themeColor="text2"/>
           <w:sz w:val="28"/>
           <w:szCs w:val="28"/>
@@ -52,6 +70,7 @@
       </w:pPr>
       <w:r>
         <w:rPr>
+          <w:rFonts w:ascii="Aptos" w:hAnsi="Aptos"/>
           <w:color w:val="1F497D" w:themeColor="text2"/>
           <w:sz w:val="28"/>
           <w:szCs w:val="28"/>
@@ -60,6 +79,7 @@
       </w:r>
       <w:r>
         <w:rPr>
+          <w:rFonts w:ascii="Aptos" w:hAnsi="Aptos"/>
           <w:color w:val="1F497D" w:themeColor="text2"/>
           <w:sz w:val="28"/>
           <w:szCs w:val="28"/>
@@ -68,98 +88,193 @@
       </w:r>
     </w:p>
     <w:p>
+      <w:pPr>
+        <w:rPr>
+          <w:rFonts w:ascii="Aptos" w:hAnsi="Aptos"/>
+        </w:rPr>
+      </w:pPr>
       <w:r>
+        <w:rPr>
+          <w:rFonts w:ascii="Aptos" w:hAnsi="Aptos"/>
+        </w:rPr>
         <w:t>Blah blah</w:t>
       </w:r>
     </w:p>
-    <w:p/>
     <w:p>
       <w:pPr>
+        <w:rPr>
+          <w:rFonts w:ascii="Aptos" w:hAnsi="Aptos"/>
+        </w:rPr>
+      </w:pPr>
+    </w:p>
+    <w:p>
+      <w:pPr>
         <w:pStyle w:val="Heading2"/>
+        <w:rPr>
+          <w:rFonts w:ascii="Aptos" w:hAnsi="Aptos"/>
+        </w:rPr>
       </w:pPr>
       <w:r>
-        <w:t>Header</w:t>
+        <w:rPr>
+          <w:rFonts w:ascii="Aptos" w:hAnsi="Aptos"/>
+        </w:rPr>
+        <w:t xml:space="preserve">Header </w:t>
       </w:r>
       <w:r>
-        <w:t xml:space="preserve"> </w:t>
-      </w:r>
-      <w:r>
+        <w:rPr>
+          <w:rFonts w:ascii="Aptos" w:hAnsi="Aptos"/>
+        </w:rPr>
         <w:t>2</w:t>
       </w:r>
     </w:p>
     <w:p>
+      <w:pPr>
+        <w:rPr>
+          <w:rFonts w:ascii="Aptos" w:hAnsi="Aptos"/>
+        </w:rPr>
+      </w:pPr>
       <w:r>
+        <w:rPr>
+          <w:rFonts w:ascii="Aptos" w:hAnsi="Aptos"/>
+        </w:rPr>
         <w:t>Blah blah</w:t>
       </w:r>
     </w:p>
-    <w:p/>
     <w:p>
       <w:pPr>
+        <w:rPr>
+          <w:rFonts w:ascii="Aptos" w:hAnsi="Aptos"/>
+        </w:rPr>
+      </w:pPr>
+    </w:p>
+    <w:p>
+      <w:pPr>
         <w:pStyle w:val="Heading3"/>
+        <w:rPr>
+          <w:rFonts w:ascii="Aptos" w:hAnsi="Aptos"/>
+        </w:rPr>
       </w:pPr>
       <w:r>
+        <w:rPr>
+          <w:rFonts w:ascii="Aptos" w:hAnsi="Aptos"/>
+        </w:rPr>
         <w:t>Header</w:t>
       </w:r>
       <w:r>
+        <w:rPr>
+          <w:rFonts w:ascii="Aptos" w:hAnsi="Aptos"/>
+        </w:rPr>
         <w:t xml:space="preserve"> </w:t>
       </w:r>
       <w:r>
+        <w:rPr>
+          <w:rFonts w:ascii="Aptos" w:hAnsi="Aptos"/>
+        </w:rPr>
         <w:t>3</w:t>
       </w:r>
     </w:p>
     <w:p>
+      <w:pPr>
+        <w:rPr>
+          <w:rFonts w:ascii="Aptos" w:hAnsi="Aptos"/>
+        </w:rPr>
+      </w:pPr>
       <w:r>
+        <w:rPr>
+          <w:rFonts w:ascii="Aptos" w:hAnsi="Aptos"/>
+        </w:rPr>
         <w:t>Blah blah</w:t>
       </w:r>
     </w:p>
     <w:p>
       <w:pPr>
         <w:pStyle w:val="BodyText"/>
+        <w:rPr>
+          <w:rFonts w:ascii="Aptos" w:hAnsi="Aptos"/>
+        </w:rPr>
       </w:pPr>
     </w:p>
     <w:p>
       <w:pPr>
         <w:pStyle w:val="Heading4"/>
+        <w:rPr>
+          <w:rFonts w:ascii="Aptos" w:hAnsi="Aptos"/>
+        </w:rPr>
       </w:pPr>
       <w:r>
+        <w:rPr>
+          <w:rFonts w:ascii="Aptos" w:hAnsi="Aptos"/>
+        </w:rPr>
         <w:t>Header</w:t>
       </w:r>
       <w:r>
+        <w:rPr>
+          <w:rFonts w:ascii="Aptos" w:hAnsi="Aptos"/>
+        </w:rPr>
         <w:t xml:space="preserve"> </w:t>
       </w:r>
       <w:r>
+        <w:rPr>
+          <w:rFonts w:ascii="Aptos" w:hAnsi="Aptos"/>
+        </w:rPr>
         <w:t>4</w:t>
       </w:r>
     </w:p>
     <w:p>
+      <w:pPr>
+        <w:rPr>
+          <w:rFonts w:ascii="Aptos" w:hAnsi="Aptos"/>
+        </w:rPr>
+      </w:pPr>
       <w:r>
+        <w:rPr>
+          <w:rFonts w:ascii="Aptos" w:hAnsi="Aptos"/>
+        </w:rPr>
         <w:t>Blah blah</w:t>
       </w:r>
     </w:p>
     <w:p>
       <w:pPr>
         <w:pStyle w:val="BodyText"/>
+        <w:rPr>
+          <w:rFonts w:ascii="Aptos" w:hAnsi="Aptos"/>
+        </w:rPr>
       </w:pPr>
     </w:p>
     <w:p>
       <w:pPr>
         <w:pStyle w:val="Heading5"/>
+        <w:rPr>
+          <w:rFonts w:ascii="Aptos" w:hAnsi="Aptos"/>
+        </w:rPr>
       </w:pPr>
       <w:r>
+        <w:rPr>
+          <w:rFonts w:ascii="Aptos" w:hAnsi="Aptos"/>
+        </w:rPr>
         <w:t>Header 5</w:t>
       </w:r>
     </w:p>
     <w:p>
       <w:pPr>
         <w:pStyle w:val="BodyText"/>
+        <w:rPr>
+          <w:rFonts w:ascii="Aptos" w:hAnsi="Aptos"/>
+        </w:rPr>
       </w:pPr>
     </w:p>
     <w:p>
       <w:pPr>
         <w:pStyle w:val="figcaption"/>
+        <w:rPr>
+          <w:rFonts w:ascii="Aptos" w:hAnsi="Aptos"/>
+        </w:rPr>
       </w:pPr>
       <w:proofErr w:type="spellStart"/>
       <w:r>
+        <w:rPr>
+          <w:rFonts w:ascii="Aptos" w:hAnsi="Aptos"/>
+        </w:rPr>
         <w:t>figcaption</w:t>
       </w:r>
       <w:proofErr w:type="spellEnd"/>
@@ -167,22 +282,45 @@
     <w:p>
       <w:pPr>
         <w:pStyle w:val="Heading9"/>
+        <w:rPr>
+          <w:rFonts w:ascii="Aptos" w:hAnsi="Aptos"/>
+        </w:rPr>
       </w:pPr>
     </w:p>
     <w:p>
+      <w:pPr>
+        <w:rPr>
+          <w:rFonts w:ascii="Aptos" w:hAnsi="Aptos"/>
+        </w:rPr>
+      </w:pPr>
       <w:r>
+        <w:rPr>
+          <w:rFonts w:ascii="Aptos" w:hAnsi="Aptos"/>
+        </w:rPr>
         <w:t>Header</w:t>
       </w:r>
       <w:r>
+        <w:rPr>
+          <w:rFonts w:ascii="Aptos" w:hAnsi="Aptos"/>
+        </w:rPr>
         <w:t xml:space="preserve"> </w:t>
       </w:r>
       <w:r>
+        <w:rPr>
+          <w:rFonts w:ascii="Aptos" w:hAnsi="Aptos"/>
+        </w:rPr>
         <w:t xml:space="preserve">9 </w:t>
       </w:r>
       <w:r>
+        <w:rPr>
+          <w:rFonts w:ascii="Aptos" w:hAnsi="Aptos"/>
+        </w:rPr>
         <w:t xml:space="preserve">(above this line) </w:t>
       </w:r>
       <w:r>
+        <w:rPr>
+          <w:rFonts w:ascii="Aptos" w:hAnsi="Aptos"/>
+        </w:rPr>
         <w:t>is white and with page break:</w:t>
       </w:r>
     </w:p>
@@ -190,12 +328,14 @@
       <w:pPr>
         <w:rPr>
           <w:rStyle w:val="stim"/>
+          <w:rFonts w:ascii="Aptos" w:hAnsi="Aptos"/>
         </w:rPr>
       </w:pPr>
       <w:proofErr w:type="spellStart"/>
       <w:r>
         <w:rPr>
           <w:rStyle w:val="stim"/>
+          <w:rFonts w:ascii="Aptos" w:hAnsi="Aptos"/>
         </w:rPr>
         <w:t>Kinase_up</w:t>
       </w:r>
@@ -205,12 +345,14 @@
       <w:pPr>
         <w:rPr>
           <w:rStyle w:val="inhib"/>
+          <w:rFonts w:ascii="Aptos" w:hAnsi="Aptos"/>
         </w:rPr>
       </w:pPr>
       <w:proofErr w:type="spellStart"/>
       <w:r>
         <w:rPr>
           <w:rStyle w:val="inhib"/>
+          <w:rFonts w:ascii="Aptos" w:hAnsi="Aptos"/>
         </w:rPr>
         <w:t>Kinase_down</w:t>
       </w:r>
@@ -220,24 +362,24 @@
       <w:pPr>
         <w:rPr>
           <w:rStyle w:val="Kinasesame"/>
+          <w:rFonts w:ascii="Aptos" w:hAnsi="Aptos"/>
         </w:rPr>
       </w:pPr>
       <w:proofErr w:type="spellStart"/>
       <w:r>
         <w:rPr>
           <w:rStyle w:val="Kinasesame"/>
+          <w:rFonts w:ascii="Aptos" w:hAnsi="Aptos"/>
         </w:rPr>
         <w:t>Kinase_same</w:t>
       </w:r>
       <w:proofErr w:type="spellEnd"/>
     </w:p>
     <w:sectPr>
-      <w:headerReference w:type="even" r:id="rId8"/>
-      <w:headerReference w:type="default" r:id="rId9"/>
-      <w:footerReference w:type="even" r:id="rId10"/>
-      <w:footerReference w:type="default" r:id="rId11"/>
-      <w:headerReference w:type="first" r:id="rId12"/>
-      <w:footerReference w:type="first" r:id="rId13"/>
+      <w:headerReference w:type="default" r:id="rId8"/>
+      <w:footerReference w:type="default" r:id="rId9"/>
+      <w:headerReference w:type="first" r:id="rId10"/>
+      <w:footerReference w:type="first" r:id="rId11"/>
       <w:pgSz w:w="11907" w:h="16839" w:code="9"/>
       <w:pgMar w:top="1440" w:right="1440" w:bottom="1440" w:left="1440" w:header="720" w:footer="720" w:gutter="0"/>
       <w:cols w:space="720"/>
@@ -249,7 +391,7 @@
 </file>
 
 <file path=word/endnotes.xml><?xml version="1.0" encoding="utf-8"?>
-<w:endnotes xmlns:wpc="http://schemas.microsoft.com/office/word/2010/wordprocessingCanvas" xmlns:cx="http://schemas.microsoft.com/office/drawing/2014/chartex" xmlns:cx1="http://schemas.microsoft.com/office/drawing/2015/9/8/chartex" xmlns:cx2="http://schemas.microsoft.com/office/drawing/2015/10/21/chartex" xmlns:cx3="http://schemas.microsoft.com/office/drawing/2016/5/9/chartex" xmlns:cx4="http://schemas.microsoft.com/office/drawing/2016/5/10/chartex" xmlns:cx5="http://schemas.microsoft.com/office/drawing/2016/5/11/chartex" xmlns:cx6="http://schemas.microsoft.com/office/drawing/2016/5/12/chartex" xmlns:cx7="http://schemas.microsoft.com/office/drawing/2016/5/13/chartex" xmlns:cx8="http://schemas.microsoft.com/office/drawing/2016/5/14/chartex" xmlns:mc="http://schemas.openxmlformats.org/markup-compatibility/2006" xmlns:aink="http://schemas.microsoft.com/office/drawing/2016/ink" xmlns:am3d="http://schemas.microsoft.com/office/drawing/2017/model3d" xmlns:o="urn:schemas-microsoft-com:office:office" xmlns:r="http://schemas.openxmlformats.org/officeDocument/2006/relationships" xmlns:m="http://schemas.openxmlformats.org/officeDocument/2006/math" xmlns:v="urn:schemas-microsoft-com:vml" xmlns:wp14="http://schemas.microsoft.com/office/word/2010/wordprocessingDrawing" xmlns:wp="http://schemas.openxmlformats.org/drawingml/2006/wordprocessingDrawing" xmlns:w10="urn:schemas-microsoft-com:office:word" xmlns:w="http://schemas.openxmlformats.org/wordprocessingml/2006/main" xmlns:w14="http://schemas.microsoft.com/office/word/2010/wordml" xmlns:w15="http://schemas.microsoft.com/office/word/2012/wordml" xmlns:w16cex="http://schemas.microsoft.com/office/word/2018/wordml/cex" xmlns:w16cid="http://schemas.microsoft.com/office/word/2016/wordml/cid" xmlns:w16="http://schemas.microsoft.com/office/word/2018/wordml" xmlns:w16sdtdh="http://schemas.microsoft.com/office/word/2020/wordml/sdtdatahash" xmlns:w16se="http://schemas.microsoft.com/office/word/2015/wordml/symex" xmlns:wpg="http://schemas.microsoft.com/office/word/2010/wordprocessingGroup" xmlns:wpi="http://schemas.microsoft.com/office/word/2010/wordprocessingInk" xmlns:wne="http://schemas.microsoft.com/office/word/2006/wordml" xmlns:wps="http://schemas.microsoft.com/office/word/2010/wordprocessingShape" mc:Ignorable="w14 w15 w16se w16cid w16 w16cex w16sdtdh wp14">
+<w:endnotes xmlns:wpc="http://schemas.microsoft.com/office/word/2010/wordprocessingCanvas" xmlns:cx="http://schemas.microsoft.com/office/drawing/2014/chartex" xmlns:cx1="http://schemas.microsoft.com/office/drawing/2015/9/8/chartex" xmlns:cx2="http://schemas.microsoft.com/office/drawing/2015/10/21/chartex" xmlns:cx3="http://schemas.microsoft.com/office/drawing/2016/5/9/chartex" xmlns:cx4="http://schemas.microsoft.com/office/drawing/2016/5/10/chartex" xmlns:cx5="http://schemas.microsoft.com/office/drawing/2016/5/11/chartex" xmlns:cx6="http://schemas.microsoft.com/office/drawing/2016/5/12/chartex" xmlns:cx7="http://schemas.microsoft.com/office/drawing/2016/5/13/chartex" xmlns:cx8="http://schemas.microsoft.com/office/drawing/2016/5/14/chartex" xmlns:mc="http://schemas.openxmlformats.org/markup-compatibility/2006" xmlns:aink="http://schemas.microsoft.com/office/drawing/2016/ink" xmlns:am3d="http://schemas.microsoft.com/office/drawing/2017/model3d" xmlns:o="urn:schemas-microsoft-com:office:office" xmlns:oel="http://schemas.microsoft.com/office/2019/extlst" xmlns:r="http://schemas.openxmlformats.org/officeDocument/2006/relationships" xmlns:m="http://schemas.openxmlformats.org/officeDocument/2006/math" xmlns:v="urn:schemas-microsoft-com:vml" xmlns:wp14="http://schemas.microsoft.com/office/word/2010/wordprocessingDrawing" xmlns:wp="http://schemas.openxmlformats.org/drawingml/2006/wordprocessingDrawing" xmlns:w10="urn:schemas-microsoft-com:office:word" xmlns:w="http://schemas.openxmlformats.org/wordprocessingml/2006/main" xmlns:w14="http://schemas.microsoft.com/office/word/2010/wordml" xmlns:w15="http://schemas.microsoft.com/office/word/2012/wordml" xmlns:w16cex="http://schemas.microsoft.com/office/word/2018/wordml/cex" xmlns:w16cid="http://schemas.microsoft.com/office/word/2016/wordml/cid" xmlns:w16="http://schemas.microsoft.com/office/word/2018/wordml" xmlns:w16du="http://schemas.microsoft.com/office/word/2023/wordml/word16du" xmlns:w16sdtdh="http://schemas.microsoft.com/office/word/2020/wordml/sdtdatahash" xmlns:w16sdtfl="http://schemas.microsoft.com/office/word/2024/wordml/sdtformatlock" xmlns:w16se="http://schemas.microsoft.com/office/word/2015/wordml/symex" xmlns:wpg="http://schemas.microsoft.com/office/word/2010/wordprocessingGroup" xmlns:wpi="http://schemas.microsoft.com/office/word/2010/wordprocessingInk" xmlns:wne="http://schemas.microsoft.com/office/word/2006/wordml" xmlns:wps="http://schemas.microsoft.com/office/word/2010/wordprocessingShape" mc:Ignorable="w14 w15 w16se w16cid w16 w16cex w16sdtdh w16sdtfl w16du wp14">
   <w:endnote w:type="separator" w:id="-1">
     <w:p>
       <w:pPr>
@@ -274,17 +416,7 @@
 </file>
 
 <file path=word/footer1.xml><?xml version="1.0" encoding="utf-8"?>
-<w:ftr xmlns:wpc="http://schemas.microsoft.com/office/word/2010/wordprocessingCanvas" xmlns:cx="http://schemas.microsoft.com/office/drawing/2014/chartex" xmlns:cx1="http://schemas.microsoft.com/office/drawing/2015/9/8/chartex" xmlns:cx2="http://schemas.microsoft.com/office/drawing/2015/10/21/chartex" xmlns:cx3="http://schemas.microsoft.com/office/drawing/2016/5/9/chartex" xmlns:cx4="http://schemas.microsoft.com/office/drawing/2016/5/10/chartex" xmlns:cx5="http://schemas.microsoft.com/office/drawing/2016/5/11/chartex" xmlns:cx6="http://schemas.microsoft.com/office/drawing/2016/5/12/chartex" xmlns:cx7="http://schemas.microsoft.com/office/drawing/2016/5/13/chartex" xmlns:cx8="http://schemas.microsoft.com/office/drawing/2016/5/14/chartex" xmlns:mc="http://schemas.openxmlformats.org/markup-compatibility/2006" xmlns:aink="http://schemas.microsoft.com/office/drawing/2016/ink" xmlns:am3d="http://schemas.microsoft.com/office/drawing/2017/model3d" xmlns:o="urn:schemas-microsoft-com:office:office" xmlns:r="http://schemas.openxmlformats.org/officeDocument/2006/relationships" xmlns:m="http://schemas.openxmlformats.org/officeDocument/2006/math" xmlns:v="urn:schemas-microsoft-com:vml" xmlns:wp14="http://schemas.microsoft.com/office/word/2010/wordprocessingDrawing" xmlns:wp="http://schemas.openxmlformats.org/drawingml/2006/wordprocessingDrawing" xmlns:w10="urn:schemas-microsoft-com:office:word" xmlns:w="http://schemas.openxmlformats.org/wordprocessingml/2006/main" xmlns:w14="http://schemas.microsoft.com/office/word/2010/wordml" xmlns:w15="http://schemas.microsoft.com/office/word/2012/wordml" xmlns:w16cex="http://schemas.microsoft.com/office/word/2018/wordml/cex" xmlns:w16cid="http://schemas.microsoft.com/office/word/2016/wordml/cid" xmlns:w16="http://schemas.microsoft.com/office/word/2018/wordml" xmlns:w16sdtdh="http://schemas.microsoft.com/office/word/2020/wordml/sdtdatahash" xmlns:w16se="http://schemas.microsoft.com/office/word/2015/wordml/symex" xmlns:wpg="http://schemas.microsoft.com/office/word/2010/wordprocessingGroup" xmlns:wpi="http://schemas.microsoft.com/office/word/2010/wordprocessingInk" xmlns:wne="http://schemas.microsoft.com/office/word/2006/wordml" xmlns:wps="http://schemas.microsoft.com/office/word/2010/wordprocessingShape" mc:Ignorable="w14 w15 w16se w16cid w16 w16cex w16sdtdh wp14">
-  <w:p>
-    <w:pPr>
-      <w:pStyle w:val="Footer"/>
-    </w:pPr>
-  </w:p>
-</w:ftr>
-</file>
-
-<file path=word/footer2.xml><?xml version="1.0" encoding="utf-8"?>
-<w:ftr xmlns:wpc="http://schemas.microsoft.com/office/word/2010/wordprocessingCanvas" xmlns:cx="http://schemas.microsoft.com/office/drawing/2014/chartex" xmlns:cx1="http://schemas.microsoft.com/office/drawing/2015/9/8/chartex" xmlns:cx2="http://schemas.microsoft.com/office/drawing/2015/10/21/chartex" xmlns:cx3="http://schemas.microsoft.com/office/drawing/2016/5/9/chartex" xmlns:cx4="http://schemas.microsoft.com/office/drawing/2016/5/10/chartex" xmlns:cx5="http://schemas.microsoft.com/office/drawing/2016/5/11/chartex" xmlns:cx6="http://schemas.microsoft.com/office/drawing/2016/5/12/chartex" xmlns:cx7="http://schemas.microsoft.com/office/drawing/2016/5/13/chartex" xmlns:cx8="http://schemas.microsoft.com/office/drawing/2016/5/14/chartex" xmlns:mc="http://schemas.openxmlformats.org/markup-compatibility/2006" xmlns:aink="http://schemas.microsoft.com/office/drawing/2016/ink" xmlns:am3d="http://schemas.microsoft.com/office/drawing/2017/model3d" xmlns:o="urn:schemas-microsoft-com:office:office" xmlns:r="http://schemas.openxmlformats.org/officeDocument/2006/relationships" xmlns:m="http://schemas.openxmlformats.org/officeDocument/2006/math" xmlns:v="urn:schemas-microsoft-com:vml" xmlns:wp14="http://schemas.microsoft.com/office/word/2010/wordprocessingDrawing" xmlns:wp="http://schemas.openxmlformats.org/drawingml/2006/wordprocessingDrawing" xmlns:w10="urn:schemas-microsoft-com:office:word" xmlns:w="http://schemas.openxmlformats.org/wordprocessingml/2006/main" xmlns:w14="http://schemas.microsoft.com/office/word/2010/wordml" xmlns:w15="http://schemas.microsoft.com/office/word/2012/wordml" xmlns:w16cex="http://schemas.microsoft.com/office/word/2018/wordml/cex" xmlns:w16cid="http://schemas.microsoft.com/office/word/2016/wordml/cid" xmlns:w16="http://schemas.microsoft.com/office/word/2018/wordml" xmlns:w16sdtdh="http://schemas.microsoft.com/office/word/2020/wordml/sdtdatahash" xmlns:w16se="http://schemas.microsoft.com/office/word/2015/wordml/symex" xmlns:wpg="http://schemas.microsoft.com/office/word/2010/wordprocessingGroup" xmlns:wpi="http://schemas.microsoft.com/office/word/2010/wordprocessingInk" xmlns:wne="http://schemas.microsoft.com/office/word/2006/wordml" xmlns:wps="http://schemas.microsoft.com/office/word/2010/wordprocessingShape" mc:Ignorable="w14 w15 w16se w16cid w16 w16cex w16sdtdh wp14">
+<w:ftr xmlns:wpc="http://schemas.microsoft.com/office/word/2010/wordprocessingCanvas" xmlns:cx="http://schemas.microsoft.com/office/drawing/2014/chartex" xmlns:cx1="http://schemas.microsoft.com/office/drawing/2015/9/8/chartex" xmlns:cx2="http://schemas.microsoft.com/office/drawing/2015/10/21/chartex" xmlns:cx3="http://schemas.microsoft.com/office/drawing/2016/5/9/chartex" xmlns:cx4="http://schemas.microsoft.com/office/drawing/2016/5/10/chartex" xmlns:cx5="http://schemas.microsoft.com/office/drawing/2016/5/11/chartex" xmlns:cx6="http://schemas.microsoft.com/office/drawing/2016/5/12/chartex" xmlns:cx7="http://schemas.microsoft.com/office/drawing/2016/5/13/chartex" xmlns:cx8="http://schemas.microsoft.com/office/drawing/2016/5/14/chartex" xmlns:mc="http://schemas.openxmlformats.org/markup-compatibility/2006" xmlns:aink="http://schemas.microsoft.com/office/drawing/2016/ink" xmlns:am3d="http://schemas.microsoft.com/office/drawing/2017/model3d" xmlns:o="urn:schemas-microsoft-com:office:office" xmlns:oel="http://schemas.microsoft.com/office/2019/extlst" xmlns:r="http://schemas.openxmlformats.org/officeDocument/2006/relationships" xmlns:m="http://schemas.openxmlformats.org/officeDocument/2006/math" xmlns:v="urn:schemas-microsoft-com:vml" xmlns:wp14="http://schemas.microsoft.com/office/word/2010/wordprocessingDrawing" xmlns:wp="http://schemas.openxmlformats.org/drawingml/2006/wordprocessingDrawing" xmlns:w10="urn:schemas-microsoft-com:office:word" xmlns:w="http://schemas.openxmlformats.org/wordprocessingml/2006/main" xmlns:w14="http://schemas.microsoft.com/office/word/2010/wordml" xmlns:w15="http://schemas.microsoft.com/office/word/2012/wordml" xmlns:w16cex="http://schemas.microsoft.com/office/word/2018/wordml/cex" xmlns:w16cid="http://schemas.microsoft.com/office/word/2016/wordml/cid" xmlns:w16="http://schemas.microsoft.com/office/word/2018/wordml" xmlns:w16du="http://schemas.microsoft.com/office/word/2023/wordml/word16du" xmlns:w16sdtdh="http://schemas.microsoft.com/office/word/2020/wordml/sdtdatahash" xmlns:w16sdtfl="http://schemas.microsoft.com/office/word/2024/wordml/sdtformatlock" xmlns:w16se="http://schemas.microsoft.com/office/word/2015/wordml/symex" xmlns:wpg="http://schemas.microsoft.com/office/word/2010/wordprocessingGroup" xmlns:wpi="http://schemas.microsoft.com/office/word/2010/wordprocessingInk" xmlns:wne="http://schemas.microsoft.com/office/word/2006/wordml" xmlns:wps="http://schemas.microsoft.com/office/word/2010/wordprocessingShape" mc:Ignorable="w14 w15 w16se w16cid w16 w16cex w16sdtdh w16sdtfl w16du wp14">
   <w:sdt>
     <w:sdtPr>
       <w:id w:val="1732111690"/>
@@ -357,8 +489,8 @@
 </w:ftr>
 </file>
 
-<file path=word/footer3.xml><?xml version="1.0" encoding="utf-8"?>
-<w:ftr xmlns:wpc="http://schemas.microsoft.com/office/word/2010/wordprocessingCanvas" xmlns:cx="http://schemas.microsoft.com/office/drawing/2014/chartex" xmlns:cx1="http://schemas.microsoft.com/office/drawing/2015/9/8/chartex" xmlns:cx2="http://schemas.microsoft.com/office/drawing/2015/10/21/chartex" xmlns:cx3="http://schemas.microsoft.com/office/drawing/2016/5/9/chartex" xmlns:cx4="http://schemas.microsoft.com/office/drawing/2016/5/10/chartex" xmlns:cx5="http://schemas.microsoft.com/office/drawing/2016/5/11/chartex" xmlns:cx6="http://schemas.microsoft.com/office/drawing/2016/5/12/chartex" xmlns:cx7="http://schemas.microsoft.com/office/drawing/2016/5/13/chartex" xmlns:cx8="http://schemas.microsoft.com/office/drawing/2016/5/14/chartex" xmlns:mc="http://schemas.openxmlformats.org/markup-compatibility/2006" xmlns:aink="http://schemas.microsoft.com/office/drawing/2016/ink" xmlns:am3d="http://schemas.microsoft.com/office/drawing/2017/model3d" xmlns:o="urn:schemas-microsoft-com:office:office" xmlns:r="http://schemas.openxmlformats.org/officeDocument/2006/relationships" xmlns:m="http://schemas.openxmlformats.org/officeDocument/2006/math" xmlns:v="urn:schemas-microsoft-com:vml" xmlns:wp14="http://schemas.microsoft.com/office/word/2010/wordprocessingDrawing" xmlns:wp="http://schemas.openxmlformats.org/drawingml/2006/wordprocessingDrawing" xmlns:w10="urn:schemas-microsoft-com:office:word" xmlns:w="http://schemas.openxmlformats.org/wordprocessingml/2006/main" xmlns:w14="http://schemas.microsoft.com/office/word/2010/wordml" xmlns:w15="http://schemas.microsoft.com/office/word/2012/wordml" xmlns:w16cex="http://schemas.microsoft.com/office/word/2018/wordml/cex" xmlns:w16cid="http://schemas.microsoft.com/office/word/2016/wordml/cid" xmlns:w16="http://schemas.microsoft.com/office/word/2018/wordml" xmlns:w16sdtdh="http://schemas.microsoft.com/office/word/2020/wordml/sdtdatahash" xmlns:w16se="http://schemas.microsoft.com/office/word/2015/wordml/symex" xmlns:wpg="http://schemas.microsoft.com/office/word/2010/wordprocessingGroup" xmlns:wpi="http://schemas.microsoft.com/office/word/2010/wordprocessingInk" xmlns:wne="http://schemas.microsoft.com/office/word/2006/wordml" xmlns:wps="http://schemas.microsoft.com/office/word/2010/wordprocessingShape" mc:Ignorable="w14 w15 w16se w16cid w16 w16cex w16sdtdh wp14">
+<file path=word/footer2.xml><?xml version="1.0" encoding="utf-8"?>
+<w:ftr xmlns:wpc="http://schemas.microsoft.com/office/word/2010/wordprocessingCanvas" xmlns:cx="http://schemas.microsoft.com/office/drawing/2014/chartex" xmlns:cx1="http://schemas.microsoft.com/office/drawing/2015/9/8/chartex" xmlns:cx2="http://schemas.microsoft.com/office/drawing/2015/10/21/chartex" xmlns:cx3="http://schemas.microsoft.com/office/drawing/2016/5/9/chartex" xmlns:cx4="http://schemas.microsoft.com/office/drawing/2016/5/10/chartex" xmlns:cx5="http://schemas.microsoft.com/office/drawing/2016/5/11/chartex" xmlns:cx6="http://schemas.microsoft.com/office/drawing/2016/5/12/chartex" xmlns:cx7="http://schemas.microsoft.com/office/drawing/2016/5/13/chartex" xmlns:cx8="http://schemas.microsoft.com/office/drawing/2016/5/14/chartex" xmlns:mc="http://schemas.openxmlformats.org/markup-compatibility/2006" xmlns:aink="http://schemas.microsoft.com/office/drawing/2016/ink" xmlns:am3d="http://schemas.microsoft.com/office/drawing/2017/model3d" xmlns:o="urn:schemas-microsoft-com:office:office" xmlns:oel="http://schemas.microsoft.com/office/2019/extlst" xmlns:r="http://schemas.openxmlformats.org/officeDocument/2006/relationships" xmlns:m="http://schemas.openxmlformats.org/officeDocument/2006/math" xmlns:v="urn:schemas-microsoft-com:vml" xmlns:wp14="http://schemas.microsoft.com/office/word/2010/wordprocessingDrawing" xmlns:wp="http://schemas.openxmlformats.org/drawingml/2006/wordprocessingDrawing" xmlns:w10="urn:schemas-microsoft-com:office:word" xmlns:w="http://schemas.openxmlformats.org/wordprocessingml/2006/main" xmlns:w14="http://schemas.microsoft.com/office/word/2010/wordml" xmlns:w15="http://schemas.microsoft.com/office/word/2012/wordml" xmlns:w16cex="http://schemas.microsoft.com/office/word/2018/wordml/cex" xmlns:w16cid="http://schemas.microsoft.com/office/word/2016/wordml/cid" xmlns:w16="http://schemas.microsoft.com/office/word/2018/wordml" xmlns:w16du="http://schemas.microsoft.com/office/word/2023/wordml/word16du" xmlns:w16sdtdh="http://schemas.microsoft.com/office/word/2020/wordml/sdtdatahash" xmlns:w16sdtfl="http://schemas.microsoft.com/office/word/2024/wordml/sdtformatlock" xmlns:w16se="http://schemas.microsoft.com/office/word/2015/wordml/symex" xmlns:wpg="http://schemas.microsoft.com/office/word/2010/wordprocessingGroup" xmlns:wpi="http://schemas.microsoft.com/office/word/2010/wordprocessingInk" xmlns:wne="http://schemas.microsoft.com/office/word/2006/wordml" xmlns:wps="http://schemas.microsoft.com/office/word/2010/wordprocessingShape" mc:Ignorable="w14 w15 w16se w16cid w16 w16cex w16sdtdh w16sdtfl w16du wp14">
   <w:sdt>
     <w:sdtPr>
       <w:id w:val="-521778799"/>
@@ -432,7 +564,7 @@
 </file>
 
 <file path=word/footnotes.xml><?xml version="1.0" encoding="utf-8"?>
-<w:footnotes xmlns:wpc="http://schemas.microsoft.com/office/word/2010/wordprocessingCanvas" xmlns:cx="http://schemas.microsoft.com/office/drawing/2014/chartex" xmlns:cx1="http://schemas.microsoft.com/office/drawing/2015/9/8/chartex" xmlns:cx2="http://schemas.microsoft.com/office/drawing/2015/10/21/chartex" xmlns:cx3="http://schemas.microsoft.com/office/drawing/2016/5/9/chartex" xmlns:cx4="http://schemas.microsoft.com/office/drawing/2016/5/10/chartex" xmlns:cx5="http://schemas.microsoft.com/office/drawing/2016/5/11/chartex" xmlns:cx6="http://schemas.microsoft.com/office/drawing/2016/5/12/chartex" xmlns:cx7="http://schemas.microsoft.com/office/drawing/2016/5/13/chartex" xmlns:cx8="http://schemas.microsoft.com/office/drawing/2016/5/14/chartex" xmlns:mc="http://schemas.openxmlformats.org/markup-compatibility/2006" xmlns:aink="http://schemas.microsoft.com/office/drawing/2016/ink" xmlns:am3d="http://schemas.microsoft.com/office/drawing/2017/model3d" xmlns:o="urn:schemas-microsoft-com:office:office" xmlns:r="http://schemas.openxmlformats.org/officeDocument/2006/relationships" xmlns:m="http://schemas.openxmlformats.org/officeDocument/2006/math" xmlns:v="urn:schemas-microsoft-com:vml" xmlns:wp14="http://schemas.microsoft.com/office/word/2010/wordprocessingDrawing" xmlns:wp="http://schemas.openxmlformats.org/drawingml/2006/wordprocessingDrawing" xmlns:w10="urn:schemas-microsoft-com:office:word" xmlns:w="http://schemas.openxmlformats.org/wordprocessingml/2006/main" xmlns:w14="http://schemas.microsoft.com/office/word/2010/wordml" xmlns:w15="http://schemas.microsoft.com/office/word/2012/wordml" xmlns:w16cex="http://schemas.microsoft.com/office/word/2018/wordml/cex" xmlns:w16cid="http://schemas.microsoft.com/office/word/2016/wordml/cid" xmlns:w16="http://schemas.microsoft.com/office/word/2018/wordml" xmlns:w16sdtdh="http://schemas.microsoft.com/office/word/2020/wordml/sdtdatahash" xmlns:w16se="http://schemas.microsoft.com/office/word/2015/wordml/symex" xmlns:wpg="http://schemas.microsoft.com/office/word/2010/wordprocessingGroup" xmlns:wpi="http://schemas.microsoft.com/office/word/2010/wordprocessingInk" xmlns:wne="http://schemas.microsoft.com/office/word/2006/wordml" xmlns:wps="http://schemas.microsoft.com/office/word/2010/wordprocessingShape" mc:Ignorable="w14 w15 w16se w16cid w16 w16cex w16sdtdh wp14">
+<w:footnotes xmlns:wpc="http://schemas.microsoft.com/office/word/2010/wordprocessingCanvas" xmlns:cx="http://schemas.microsoft.com/office/drawing/2014/chartex" xmlns:cx1="http://schemas.microsoft.com/office/drawing/2015/9/8/chartex" xmlns:cx2="http://schemas.microsoft.com/office/drawing/2015/10/21/chartex" xmlns:cx3="http://schemas.microsoft.com/office/drawing/2016/5/9/chartex" xmlns:cx4="http://schemas.microsoft.com/office/drawing/2016/5/10/chartex" xmlns:cx5="http://schemas.microsoft.com/office/drawing/2016/5/11/chartex" xmlns:cx6="http://schemas.microsoft.com/office/drawing/2016/5/12/chartex" xmlns:cx7="http://schemas.microsoft.com/office/drawing/2016/5/13/chartex" xmlns:cx8="http://schemas.microsoft.com/office/drawing/2016/5/14/chartex" xmlns:mc="http://schemas.openxmlformats.org/markup-compatibility/2006" xmlns:aink="http://schemas.microsoft.com/office/drawing/2016/ink" xmlns:am3d="http://schemas.microsoft.com/office/drawing/2017/model3d" xmlns:o="urn:schemas-microsoft-com:office:office" xmlns:oel="http://schemas.microsoft.com/office/2019/extlst" xmlns:r="http://schemas.openxmlformats.org/officeDocument/2006/relationships" xmlns:m="http://schemas.openxmlformats.org/officeDocument/2006/math" xmlns:v="urn:schemas-microsoft-com:vml" xmlns:wp14="http://schemas.microsoft.com/office/word/2010/wordprocessingDrawing" xmlns:wp="http://schemas.openxmlformats.org/drawingml/2006/wordprocessingDrawing" xmlns:w10="urn:schemas-microsoft-com:office:word" xmlns:w="http://schemas.openxmlformats.org/wordprocessingml/2006/main" xmlns:w14="http://schemas.microsoft.com/office/word/2010/wordml" xmlns:w15="http://schemas.microsoft.com/office/word/2012/wordml" xmlns:w16cex="http://schemas.microsoft.com/office/word/2018/wordml/cex" xmlns:w16cid="http://schemas.microsoft.com/office/word/2016/wordml/cid" xmlns:w16="http://schemas.microsoft.com/office/word/2018/wordml" xmlns:w16du="http://schemas.microsoft.com/office/word/2023/wordml/word16du" xmlns:w16sdtdh="http://schemas.microsoft.com/office/word/2020/wordml/sdtdatahash" xmlns:w16sdtfl="http://schemas.microsoft.com/office/word/2024/wordml/sdtformatlock" xmlns:w16se="http://schemas.microsoft.com/office/word/2015/wordml/symex" xmlns:wpg="http://schemas.microsoft.com/office/word/2010/wordprocessingGroup" xmlns:wpi="http://schemas.microsoft.com/office/word/2010/wordprocessingInk" xmlns:wne="http://schemas.microsoft.com/office/word/2006/wordml" xmlns:wps="http://schemas.microsoft.com/office/word/2010/wordprocessingShape" mc:Ignorable="w14 w15 w16se w16cid w16 w16cex w16sdtdh w16sdtfl w16du wp14">
   <w:footnote w:type="separator" w:id="-1">
     <w:p>
       <w:r>
@@ -451,17 +583,7 @@
 </file>
 
 <file path=word/header1.xml><?xml version="1.0" encoding="utf-8"?>
-<w:hdr xmlns:wpc="http://schemas.microsoft.com/office/word/2010/wordprocessingCanvas" xmlns:cx="http://schemas.microsoft.com/office/drawing/2014/chartex" xmlns:cx1="http://schemas.microsoft.com/office/drawing/2015/9/8/chartex" xmlns:cx2="http://schemas.microsoft.com/office/drawing/2015/10/21/chartex" xmlns:cx3="http://schemas.microsoft.com/office/drawing/2016/5/9/chartex" xmlns:cx4="http://schemas.microsoft.com/office/drawing/2016/5/10/chartex" xmlns:cx5="http://schemas.microsoft.com/office/drawing/2016/5/11/chartex" xmlns:cx6="http://schemas.microsoft.com/office/drawing/2016/5/12/chartex" xmlns:cx7="http://schemas.microsoft.com/office/drawing/2016/5/13/chartex" xmlns:cx8="http://schemas.microsoft.com/office/drawing/2016/5/14/chartex" xmlns:mc="http://schemas.openxmlformats.org/markup-compatibility/2006" xmlns:aink="http://schemas.microsoft.com/office/drawing/2016/ink" xmlns:am3d="http://schemas.microsoft.com/office/drawing/2017/model3d" xmlns:o="urn:schemas-microsoft-com:office:office" xmlns:r="http://schemas.openxmlformats.org/officeDocument/2006/relationships" xmlns:m="http://schemas.openxmlformats.org/officeDocument/2006/math" xmlns:v="urn:schemas-microsoft-com:vml" xmlns:wp14="http://schemas.microsoft.com/office/word/2010/wordprocessingDrawing" xmlns:wp="http://schemas.openxmlformats.org/drawingml/2006/wordprocessingDrawing" xmlns:w10="urn:schemas-microsoft-com:office:word" xmlns:w="http://schemas.openxmlformats.org/wordprocessingml/2006/main" xmlns:w14="http://schemas.microsoft.com/office/word/2010/wordml" xmlns:w15="http://schemas.microsoft.com/office/word/2012/wordml" xmlns:w16cex="http://schemas.microsoft.com/office/word/2018/wordml/cex" xmlns:w16cid="http://schemas.microsoft.com/office/word/2016/wordml/cid" xmlns:w16="http://schemas.microsoft.com/office/word/2018/wordml" xmlns:w16sdtdh="http://schemas.microsoft.com/office/word/2020/wordml/sdtdatahash" xmlns:w16se="http://schemas.microsoft.com/office/word/2015/wordml/symex" xmlns:wpg="http://schemas.microsoft.com/office/word/2010/wordprocessingGroup" xmlns:wpi="http://schemas.microsoft.com/office/word/2010/wordprocessingInk" xmlns:wne="http://schemas.microsoft.com/office/word/2006/wordml" xmlns:wps="http://schemas.microsoft.com/office/word/2010/wordprocessingShape" mc:Ignorable="w14 w15 w16se w16cid w16 w16cex w16sdtdh wp14">
-  <w:p>
-    <w:pPr>
-      <w:pStyle w:val="Header"/>
-    </w:pPr>
-  </w:p>
-</w:hdr>
-</file>
-
-<file path=word/header2.xml><?xml version="1.0" encoding="utf-8"?>
-<w:hdr xmlns:wpc="http://schemas.microsoft.com/office/word/2010/wordprocessingCanvas" xmlns:cx="http://schemas.microsoft.com/office/drawing/2014/chartex" xmlns:cx1="http://schemas.microsoft.com/office/drawing/2015/9/8/chartex" xmlns:cx2="http://schemas.microsoft.com/office/drawing/2015/10/21/chartex" xmlns:cx3="http://schemas.microsoft.com/office/drawing/2016/5/9/chartex" xmlns:cx4="http://schemas.microsoft.com/office/drawing/2016/5/10/chartex" xmlns:cx5="http://schemas.microsoft.com/office/drawing/2016/5/11/chartex" xmlns:cx6="http://schemas.microsoft.com/office/drawing/2016/5/12/chartex" xmlns:cx7="http://schemas.microsoft.com/office/drawing/2016/5/13/chartex" xmlns:cx8="http://schemas.microsoft.com/office/drawing/2016/5/14/chartex" xmlns:mc="http://schemas.openxmlformats.org/markup-compatibility/2006" xmlns:aink="http://schemas.microsoft.com/office/drawing/2016/ink" xmlns:am3d="http://schemas.microsoft.com/office/drawing/2017/model3d" xmlns:o="urn:schemas-microsoft-com:office:office" xmlns:r="http://schemas.openxmlformats.org/officeDocument/2006/relationships" xmlns:m="http://schemas.openxmlformats.org/officeDocument/2006/math" xmlns:v="urn:schemas-microsoft-com:vml" xmlns:wp14="http://schemas.microsoft.com/office/word/2010/wordprocessingDrawing" xmlns:wp="http://schemas.openxmlformats.org/drawingml/2006/wordprocessingDrawing" xmlns:w10="urn:schemas-microsoft-com:office:word" xmlns:w="http://schemas.openxmlformats.org/wordprocessingml/2006/main" xmlns:w14="http://schemas.microsoft.com/office/word/2010/wordml" xmlns:w15="http://schemas.microsoft.com/office/word/2012/wordml" xmlns:w16cex="http://schemas.microsoft.com/office/word/2018/wordml/cex" xmlns:w16cid="http://schemas.microsoft.com/office/word/2016/wordml/cid" xmlns:w16="http://schemas.microsoft.com/office/word/2018/wordml" xmlns:w16sdtdh="http://schemas.microsoft.com/office/word/2020/wordml/sdtdatahash" xmlns:w16se="http://schemas.microsoft.com/office/word/2015/wordml/symex" xmlns:wpg="http://schemas.microsoft.com/office/word/2010/wordprocessingGroup" xmlns:wpi="http://schemas.microsoft.com/office/word/2010/wordprocessingInk" xmlns:wne="http://schemas.microsoft.com/office/word/2006/wordml" xmlns:wps="http://schemas.microsoft.com/office/word/2010/wordprocessingShape" mc:Ignorable="w14 w15 w16se w16cid w16 w16cex w16sdtdh wp14">
+<w:hdr xmlns:wpc="http://schemas.microsoft.com/office/word/2010/wordprocessingCanvas" xmlns:cx="http://schemas.microsoft.com/office/drawing/2014/chartex" xmlns:cx1="http://schemas.microsoft.com/office/drawing/2015/9/8/chartex" xmlns:cx2="http://schemas.microsoft.com/office/drawing/2015/10/21/chartex" xmlns:cx3="http://schemas.microsoft.com/office/drawing/2016/5/9/chartex" xmlns:cx4="http://schemas.microsoft.com/office/drawing/2016/5/10/chartex" xmlns:cx5="http://schemas.microsoft.com/office/drawing/2016/5/11/chartex" xmlns:cx6="http://schemas.microsoft.com/office/drawing/2016/5/12/chartex" xmlns:cx7="http://schemas.microsoft.com/office/drawing/2016/5/13/chartex" xmlns:cx8="http://schemas.microsoft.com/office/drawing/2016/5/14/chartex" xmlns:mc="http://schemas.openxmlformats.org/markup-compatibility/2006" xmlns:aink="http://schemas.microsoft.com/office/drawing/2016/ink" xmlns:am3d="http://schemas.microsoft.com/office/drawing/2017/model3d" xmlns:o="urn:schemas-microsoft-com:office:office" xmlns:oel="http://schemas.microsoft.com/office/2019/extlst" xmlns:r="http://schemas.openxmlformats.org/officeDocument/2006/relationships" xmlns:m="http://schemas.openxmlformats.org/officeDocument/2006/math" xmlns:v="urn:schemas-microsoft-com:vml" xmlns:wp14="http://schemas.microsoft.com/office/word/2010/wordprocessingDrawing" xmlns:wp="http://schemas.openxmlformats.org/drawingml/2006/wordprocessingDrawing" xmlns:w10="urn:schemas-microsoft-com:office:word" xmlns:w="http://schemas.openxmlformats.org/wordprocessingml/2006/main" xmlns:w14="http://schemas.microsoft.com/office/word/2010/wordml" xmlns:w15="http://schemas.microsoft.com/office/word/2012/wordml" xmlns:w16cex="http://schemas.microsoft.com/office/word/2018/wordml/cex" xmlns:w16cid="http://schemas.microsoft.com/office/word/2016/wordml/cid" xmlns:w16="http://schemas.microsoft.com/office/word/2018/wordml" xmlns:w16du="http://schemas.microsoft.com/office/word/2023/wordml/word16du" xmlns:w16sdtdh="http://schemas.microsoft.com/office/word/2020/wordml/sdtdatahash" xmlns:w16sdtfl="http://schemas.microsoft.com/office/word/2024/wordml/sdtformatlock" xmlns:w16se="http://schemas.microsoft.com/office/word/2015/wordml/symex" xmlns:wpg="http://schemas.microsoft.com/office/word/2010/wordprocessingGroup" xmlns:wpi="http://schemas.microsoft.com/office/word/2010/wordprocessingInk" xmlns:wne="http://schemas.microsoft.com/office/word/2006/wordml" xmlns:wps="http://schemas.microsoft.com/office/word/2010/wordprocessingShape" mc:Ignorable="w14 w15 w16se w16cid w16 w16cex w16sdtdh w16sdtfl w16du wp14">
   <w:tbl>
     <w:tblPr>
       <w:tblStyle w:val="TableGrid"/>
@@ -508,6 +630,74 @@
               <w:lang w:val="en-GB"/>
             </w:rPr>
           </w:pPr>
+          <w:r>
+            <w:rPr>
+              <w:noProof/>
+            </w:rPr>
+            <w:drawing>
+              <wp:anchor distT="0" distB="0" distL="114300" distR="114300" simplePos="0" relativeHeight="251708416" behindDoc="1" locked="0" layoutInCell="1" allowOverlap="1" wp14:anchorId="31E4CFD5" wp14:editId="361D5B9B">
+                <wp:simplePos x="0" y="0"/>
+                <wp:positionH relativeFrom="column">
+                  <wp:posOffset>5546725</wp:posOffset>
+                </wp:positionH>
+                <wp:positionV relativeFrom="paragraph">
+                  <wp:posOffset>0</wp:posOffset>
+                </wp:positionV>
+                <wp:extent cx="1299210" cy="393700"/>
+                <wp:effectExtent l="0" t="0" r="0" b="6350"/>
+                <wp:wrapTight wrapText="bothSides">
+                  <wp:wrapPolygon edited="0">
+                    <wp:start x="0" y="0"/>
+                    <wp:lineTo x="0" y="20903"/>
+                    <wp:lineTo x="21220" y="20903"/>
+                    <wp:lineTo x="21220" y="0"/>
+                    <wp:lineTo x="0" y="0"/>
+                  </wp:wrapPolygon>
+                </wp:wrapTight>
+                <wp:docPr id="1231231350" name="Picture 1"/>
+                <wp:cNvGraphicFramePr>
+                  <a:graphicFrameLocks xmlns:a="http://schemas.openxmlformats.org/drawingml/2006/main" noChangeAspect="1"/>
+                </wp:cNvGraphicFramePr>
+                <a:graphic xmlns:a="http://schemas.openxmlformats.org/drawingml/2006/main">
+                  <a:graphicData uri="http://schemas.openxmlformats.org/drawingml/2006/picture">
+                    <pic:pic xmlns:pic="http://schemas.openxmlformats.org/drawingml/2006/picture">
+                      <pic:nvPicPr>
+                        <pic:cNvPr id="165587948" name=""/>
+                        <pic:cNvPicPr/>
+                      </pic:nvPicPr>
+                      <pic:blipFill>
+                        <a:blip r:embed="rId1">
+                          <a:extLst>
+                            <a:ext uri="{28A0092B-C50C-407E-A947-70E740481C1C}">
+                              <a14:useLocalDpi xmlns:a14="http://schemas.microsoft.com/office/drawing/2010/main" val="0"/>
+                            </a:ext>
+                          </a:extLst>
+                        </a:blip>
+                        <a:stretch>
+                          <a:fillRect/>
+                        </a:stretch>
+                      </pic:blipFill>
+                      <pic:spPr>
+                        <a:xfrm>
+                          <a:off x="0" y="0"/>
+                          <a:ext cx="1299210" cy="393700"/>
+                        </a:xfrm>
+                        <a:prstGeom prst="rect">
+                          <a:avLst/>
+                        </a:prstGeom>
+                      </pic:spPr>
+                    </pic:pic>
+                  </a:graphicData>
+                </a:graphic>
+                <wp14:sizeRelH relativeFrom="page">
+                  <wp14:pctWidth>0</wp14:pctWidth>
+                </wp14:sizeRelH>
+                <wp14:sizeRelV relativeFrom="page">
+                  <wp14:pctHeight>0</wp14:pctHeight>
+                </wp14:sizeRelV>
+              </wp:anchor>
+            </w:drawing>
+          </w:r>
         </w:p>
       </w:tc>
     </w:tr>
@@ -516,89 +706,16 @@
     <w:pPr>
       <w:pStyle w:val="Header"/>
     </w:pPr>
-    <w:r>
-      <w:rPr>
-        <w:b/>
-        <w:noProof/>
-        <w:sz w:val="16"/>
-        <w:szCs w:val="16"/>
-      </w:rPr>
-      <w:drawing>
-        <wp:anchor distT="0" distB="0" distL="114300" distR="114300" simplePos="0" relativeHeight="251705344" behindDoc="0" locked="0" layoutInCell="1" allowOverlap="1" wp14:anchorId="25F11228" wp14:editId="2EA3EF45">
-          <wp:simplePos x="0" y="0"/>
-          <wp:positionH relativeFrom="column">
-            <wp:posOffset>4991100</wp:posOffset>
-          </wp:positionH>
-          <wp:positionV relativeFrom="paragraph">
-            <wp:posOffset>-516255</wp:posOffset>
-          </wp:positionV>
-          <wp:extent cx="1476375" cy="464867"/>
-          <wp:effectExtent l="0" t="0" r="0" b="0"/>
-          <wp:wrapNone/>
-          <wp:docPr id="3" name="Picture 1" descr="Logo_PamGene_Tiff"/>
-          <wp:cNvGraphicFramePr>
-            <a:graphicFrameLocks xmlns:a="http://schemas.openxmlformats.org/drawingml/2006/main" noChangeAspect="1"/>
-          </wp:cNvGraphicFramePr>
-          <a:graphic xmlns:a="http://schemas.openxmlformats.org/drawingml/2006/main">
-            <a:graphicData uri="http://schemas.openxmlformats.org/drawingml/2006/picture">
-              <pic:pic xmlns:pic="http://schemas.openxmlformats.org/drawingml/2006/picture">
-                <pic:nvPicPr>
-                  <pic:cNvPr id="0" name="Picture 1" descr="Logo_PamGene_Tiff"/>
-                  <pic:cNvPicPr>
-                    <a:picLocks noChangeAspect="1" noChangeArrowheads="1"/>
-                  </pic:cNvPicPr>
-                </pic:nvPicPr>
-                <pic:blipFill rotWithShape="1">
-                  <a:blip r:embed="rId1">
-                    <a:extLst>
-                      <a:ext uri="{28A0092B-C50C-407E-A947-70E740481C1C}">
-                        <a14:useLocalDpi xmlns:a14="http://schemas.microsoft.com/office/drawing/2010/main" val="0"/>
-                      </a:ext>
-                    </a:extLst>
-                  </a:blip>
-                  <a:srcRect t="20708" b="20940"/>
-                  <a:stretch/>
-                </pic:blipFill>
-                <pic:spPr bwMode="auto">
-                  <a:xfrm>
-                    <a:off x="0" y="0"/>
-                    <a:ext cx="1476375" cy="464867"/>
-                  </a:xfrm>
-                  <a:prstGeom prst="rect">
-                    <a:avLst/>
-                  </a:prstGeom>
-                  <a:noFill/>
-                  <a:ln>
-                    <a:noFill/>
-                  </a:ln>
-                  <a:extLst>
-                    <a:ext uri="{53640926-AAD7-44D8-BBD7-CCE9431645EC}">
-                      <a14:shadowObscured xmlns:a14="http://schemas.microsoft.com/office/drawing/2010/main"/>
-                    </a:ext>
-                  </a:extLst>
-                </pic:spPr>
-              </pic:pic>
-            </a:graphicData>
-          </a:graphic>
-          <wp14:sizeRelH relativeFrom="page">
-            <wp14:pctWidth>0</wp14:pctWidth>
-          </wp14:sizeRelH>
-          <wp14:sizeRelV relativeFrom="page">
-            <wp14:pctHeight>0</wp14:pctHeight>
-          </wp14:sizeRelV>
-        </wp:anchor>
-      </w:drawing>
-    </w:r>
   </w:p>
 </w:hdr>
 </file>
 
-<file path=word/header3.xml><?xml version="1.0" encoding="utf-8"?>
-<w:hdr xmlns:wpc="http://schemas.microsoft.com/office/word/2010/wordprocessingCanvas" xmlns:cx="http://schemas.microsoft.com/office/drawing/2014/chartex" xmlns:cx1="http://schemas.microsoft.com/office/drawing/2015/9/8/chartex" xmlns:cx2="http://schemas.microsoft.com/office/drawing/2015/10/21/chartex" xmlns:cx3="http://schemas.microsoft.com/office/drawing/2016/5/9/chartex" xmlns:cx4="http://schemas.microsoft.com/office/drawing/2016/5/10/chartex" xmlns:cx5="http://schemas.microsoft.com/office/drawing/2016/5/11/chartex" xmlns:cx6="http://schemas.microsoft.com/office/drawing/2016/5/12/chartex" xmlns:cx7="http://schemas.microsoft.com/office/drawing/2016/5/13/chartex" xmlns:cx8="http://schemas.microsoft.com/office/drawing/2016/5/14/chartex" xmlns:mc="http://schemas.openxmlformats.org/markup-compatibility/2006" xmlns:aink="http://schemas.microsoft.com/office/drawing/2016/ink" xmlns:am3d="http://schemas.microsoft.com/office/drawing/2017/model3d" xmlns:o="urn:schemas-microsoft-com:office:office" xmlns:r="http://schemas.openxmlformats.org/officeDocument/2006/relationships" xmlns:m="http://schemas.openxmlformats.org/officeDocument/2006/math" xmlns:v="urn:schemas-microsoft-com:vml" xmlns:wp14="http://schemas.microsoft.com/office/word/2010/wordprocessingDrawing" xmlns:wp="http://schemas.openxmlformats.org/drawingml/2006/wordprocessingDrawing" xmlns:w10="urn:schemas-microsoft-com:office:word" xmlns:w="http://schemas.openxmlformats.org/wordprocessingml/2006/main" xmlns:w14="http://schemas.microsoft.com/office/word/2010/wordml" xmlns:w15="http://schemas.microsoft.com/office/word/2012/wordml" xmlns:w16cex="http://schemas.microsoft.com/office/word/2018/wordml/cex" xmlns:w16cid="http://schemas.microsoft.com/office/word/2016/wordml/cid" xmlns:w16="http://schemas.microsoft.com/office/word/2018/wordml" xmlns:w16sdtdh="http://schemas.microsoft.com/office/word/2020/wordml/sdtdatahash" xmlns:w16se="http://schemas.microsoft.com/office/word/2015/wordml/symex" xmlns:wpg="http://schemas.microsoft.com/office/word/2010/wordprocessingGroup" xmlns:wpi="http://schemas.microsoft.com/office/word/2010/wordprocessingInk" xmlns:wne="http://schemas.microsoft.com/office/word/2006/wordml" xmlns:wps="http://schemas.microsoft.com/office/word/2010/wordprocessingShape" mc:Ignorable="w14 w15 w16se w16cid w16 w16cex w16sdtdh wp14">
+<file path=word/header2.xml><?xml version="1.0" encoding="utf-8"?>
+<w:hdr xmlns:wpc="http://schemas.microsoft.com/office/word/2010/wordprocessingCanvas" xmlns:cx="http://schemas.microsoft.com/office/drawing/2014/chartex" xmlns:cx1="http://schemas.microsoft.com/office/drawing/2015/9/8/chartex" xmlns:cx2="http://schemas.microsoft.com/office/drawing/2015/10/21/chartex" xmlns:cx3="http://schemas.microsoft.com/office/drawing/2016/5/9/chartex" xmlns:cx4="http://schemas.microsoft.com/office/drawing/2016/5/10/chartex" xmlns:cx5="http://schemas.microsoft.com/office/drawing/2016/5/11/chartex" xmlns:cx6="http://schemas.microsoft.com/office/drawing/2016/5/12/chartex" xmlns:cx7="http://schemas.microsoft.com/office/drawing/2016/5/13/chartex" xmlns:cx8="http://schemas.microsoft.com/office/drawing/2016/5/14/chartex" xmlns:mc="http://schemas.openxmlformats.org/markup-compatibility/2006" xmlns:aink="http://schemas.microsoft.com/office/drawing/2016/ink" xmlns:am3d="http://schemas.microsoft.com/office/drawing/2017/model3d" xmlns:o="urn:schemas-microsoft-com:office:office" xmlns:oel="http://schemas.microsoft.com/office/2019/extlst" xmlns:r="http://schemas.openxmlformats.org/officeDocument/2006/relationships" xmlns:m="http://schemas.openxmlformats.org/officeDocument/2006/math" xmlns:v="urn:schemas-microsoft-com:vml" xmlns:wp14="http://schemas.microsoft.com/office/word/2010/wordprocessingDrawing" xmlns:wp="http://schemas.openxmlformats.org/drawingml/2006/wordprocessingDrawing" xmlns:w10="urn:schemas-microsoft-com:office:word" xmlns:w="http://schemas.openxmlformats.org/wordprocessingml/2006/main" xmlns:w14="http://schemas.microsoft.com/office/word/2010/wordml" xmlns:w15="http://schemas.microsoft.com/office/word/2012/wordml" xmlns:w16cex="http://schemas.microsoft.com/office/word/2018/wordml/cex" xmlns:w16cid="http://schemas.microsoft.com/office/word/2016/wordml/cid" xmlns:w16="http://schemas.microsoft.com/office/word/2018/wordml" xmlns:w16du="http://schemas.microsoft.com/office/word/2023/wordml/word16du" xmlns:w16sdtdh="http://schemas.microsoft.com/office/word/2020/wordml/sdtdatahash" xmlns:w16sdtfl="http://schemas.microsoft.com/office/word/2024/wordml/sdtformatlock" xmlns:w16se="http://schemas.microsoft.com/office/word/2015/wordml/symex" xmlns:wpg="http://schemas.microsoft.com/office/word/2010/wordprocessingGroup" xmlns:wpi="http://schemas.microsoft.com/office/word/2010/wordprocessingInk" xmlns:wne="http://schemas.microsoft.com/office/word/2006/wordml" xmlns:wps="http://schemas.microsoft.com/office/word/2010/wordprocessingShape" mc:Ignorable="w14 w15 w16se w16cid w16 w16cex w16sdtdh w16sdtfl w16du wp14">
   <w:tbl>
     <w:tblPr>
       <w:tblStyle w:val="TableGrid"/>
-      <w:tblW w:w="11057" w:type="dxa"/>
+      <w:tblW w:w="3686" w:type="dxa"/>
       <w:tblInd w:w="-851" w:type="dxa"/>
       <w:tblBorders>
         <w:top w:val="none" w:sz="0" w:space="0" w:color="auto"/>
@@ -611,15 +728,15 @@
       <w:tblLook w:val="04A0" w:firstRow="1" w:lastRow="0" w:firstColumn="1" w:lastColumn="0" w:noHBand="0" w:noVBand="1"/>
     </w:tblPr>
     <w:tblGrid>
-      <w:gridCol w:w="11057"/>
+      <w:gridCol w:w="3686"/>
     </w:tblGrid>
     <w:tr>
       <w:trPr>
-        <w:trHeight w:val="1567"/>
+        <w:trHeight w:val="1135"/>
       </w:trPr>
       <w:tc>
         <w:tcPr>
-          <w:tcW w:w="11057" w:type="dxa"/>
+          <w:tcW w:w="3686" w:type="dxa"/>
           <w:tcBorders>
             <w:bottom w:val="single" w:sz="8" w:space="0" w:color="244061" w:themeColor="accent1" w:themeShade="80"/>
           </w:tcBorders>
@@ -661,7 +778,29 @@
               <w:szCs w:val="16"/>
               <w:lang w:val="en-GB"/>
             </w:rPr>
-            <w:t>ww.pamgene.com</w:t>
+            <w:t>ww.pam</w:t>
+          </w:r>
+          <w:r>
+            <w:rPr>
+              <w:b/>
+              <w:bCs/>
+              <w:color w:val="0F243E" w:themeColor="text2" w:themeShade="80"/>
+              <w:sz w:val="16"/>
+              <w:szCs w:val="16"/>
+              <w:lang w:val="en-GB"/>
+            </w:rPr>
+            <w:t>dx</w:t>
+          </w:r>
+          <w:r>
+            <w:rPr>
+              <w:b/>
+              <w:bCs/>
+              <w:color w:val="0F243E" w:themeColor="text2" w:themeShade="80"/>
+              <w:sz w:val="16"/>
+              <w:szCs w:val="16"/>
+              <w:lang w:val="en-GB"/>
+            </w:rPr>
+            <w:t>.com</w:t>
           </w:r>
         </w:p>
         <w:p>
@@ -690,7 +829,29 @@
               <w:szCs w:val="16"/>
               <w:lang w:val="en-GB"/>
             </w:rPr>
-            <w:t>Support email: Support@pamgene.com</w:t>
+            <w:t>Support email: Support@pam</w:t>
+          </w:r>
+          <w:r>
+            <w:rPr>
+              <w:b/>
+              <w:bCs/>
+              <w:color w:val="0F243E" w:themeColor="text2" w:themeShade="80"/>
+              <w:sz w:val="16"/>
+              <w:szCs w:val="16"/>
+              <w:lang w:val="en-GB"/>
+            </w:rPr>
+            <w:t>dx</w:t>
+          </w:r>
+          <w:r>
+            <w:rPr>
+              <w:b/>
+              <w:bCs/>
+              <w:color w:val="0F243E" w:themeColor="text2" w:themeShade="80"/>
+              <w:sz w:val="16"/>
+              <w:szCs w:val="16"/>
+              <w:lang w:val="en-GB"/>
+            </w:rPr>
+            <w:t>.com</w:t>
           </w:r>
         </w:p>
         <w:p>
@@ -802,24 +963,29 @@
     </w:pPr>
     <w:r>
       <w:rPr>
-        <w:b/>
         <w:noProof/>
-        <w:sz w:val="16"/>
-        <w:szCs w:val="16"/>
       </w:rPr>
       <w:drawing>
-        <wp:anchor distT="0" distB="0" distL="114300" distR="114300" simplePos="0" relativeHeight="251700224" behindDoc="0" locked="0" layoutInCell="1" allowOverlap="1" wp14:anchorId="5C44995C" wp14:editId="4EBC4419">
+        <wp:anchor distT="0" distB="0" distL="114300" distR="114300" simplePos="0" relativeHeight="251706368" behindDoc="1" locked="0" layoutInCell="1" allowOverlap="1" wp14:anchorId="489C9466" wp14:editId="54B7B4C1">
           <wp:simplePos x="0" y="0"/>
           <wp:positionH relativeFrom="column">
-            <wp:posOffset>2878455</wp:posOffset>
+            <wp:posOffset>3619500</wp:posOffset>
           </wp:positionH>
           <wp:positionV relativeFrom="paragraph">
-            <wp:posOffset>-1158570</wp:posOffset>
+            <wp:posOffset>-923925</wp:posOffset>
           </wp:positionV>
-          <wp:extent cx="3599815" cy="1133475"/>
-          <wp:effectExtent l="0" t="0" r="635" b="9525"/>
-          <wp:wrapNone/>
-          <wp:docPr id="5" name="Picture 1" descr="Logo_PamGene_Tiff"/>
+          <wp:extent cx="2640965" cy="800735"/>
+          <wp:effectExtent l="0" t="0" r="6985" b="0"/>
+          <wp:wrapTight wrapText="bothSides">
+            <wp:wrapPolygon edited="0">
+              <wp:start x="0" y="0"/>
+              <wp:lineTo x="0" y="21069"/>
+              <wp:lineTo x="21501" y="21069"/>
+              <wp:lineTo x="21501" y="0"/>
+              <wp:lineTo x="0" y="0"/>
+            </wp:wrapPolygon>
+          </wp:wrapTight>
+          <wp:docPr id="165587948" name="Picture 1"/>
           <wp:cNvGraphicFramePr>
             <a:graphicFrameLocks xmlns:a="http://schemas.openxmlformats.org/drawingml/2006/main" noChangeAspect="1"/>
           </wp:cNvGraphicFramePr>
@@ -827,12 +993,10 @@
             <a:graphicData uri="http://schemas.openxmlformats.org/drawingml/2006/picture">
               <pic:pic xmlns:pic="http://schemas.openxmlformats.org/drawingml/2006/picture">
                 <pic:nvPicPr>
-                  <pic:cNvPr id="0" name="Picture 1" descr="Logo_PamGene_Tiff"/>
-                  <pic:cNvPicPr>
-                    <a:picLocks noChangeAspect="1" noChangeArrowheads="1"/>
-                  </pic:cNvPicPr>
+                  <pic:cNvPr id="165587948" name=""/>
+                  <pic:cNvPicPr/>
                 </pic:nvPicPr>
-                <pic:blipFill rotWithShape="1">
+                <pic:blipFill>
                   <a:blip r:embed="rId1">
                     <a:extLst>
                       <a:ext uri="{28A0092B-C50C-407E-A947-70E740481C1C}">
@@ -840,26 +1004,18 @@
                       </a:ext>
                     </a:extLst>
                   </a:blip>
-                  <a:srcRect t="20708" b="20940"/>
-                  <a:stretch/>
+                  <a:stretch>
+                    <a:fillRect/>
+                  </a:stretch>
                 </pic:blipFill>
-                <pic:spPr bwMode="auto">
+                <pic:spPr>
                   <a:xfrm>
                     <a:off x="0" y="0"/>
-                    <a:ext cx="3599815" cy="1133475"/>
+                    <a:ext cx="2640965" cy="800735"/>
                   </a:xfrm>
                   <a:prstGeom prst="rect">
                     <a:avLst/>
                   </a:prstGeom>
-                  <a:noFill/>
-                  <a:ln>
-                    <a:noFill/>
-                  </a:ln>
-                  <a:extLst>
-                    <a:ext uri="{53640926-AAD7-44D8-BBD7-CCE9431645EC}">
-                      <a14:shadowObscured xmlns:a14="http://schemas.microsoft.com/office/drawing/2010/main"/>
-                    </a:ext>
-                  </a:extLst>
                 </pic:spPr>
               </pic:pic>
             </a:graphicData>
@@ -878,7 +1034,7 @@
 </file>
 
 <file path=word/numbering.xml><?xml version="1.0" encoding="utf-8"?>
-<w:numbering xmlns:wpc="http://schemas.microsoft.com/office/word/2010/wordprocessingCanvas" xmlns:cx="http://schemas.microsoft.com/office/drawing/2014/chartex" xmlns:cx1="http://schemas.microsoft.com/office/drawing/2015/9/8/chartex" xmlns:cx2="http://schemas.microsoft.com/office/drawing/2015/10/21/chartex" xmlns:cx3="http://schemas.microsoft.com/office/drawing/2016/5/9/chartex" xmlns:cx4="http://schemas.microsoft.com/office/drawing/2016/5/10/chartex" xmlns:cx5="http://schemas.microsoft.com/office/drawing/2016/5/11/chartex" xmlns:cx6="http://schemas.microsoft.com/office/drawing/2016/5/12/chartex" xmlns:cx7="http://schemas.microsoft.com/office/drawing/2016/5/13/chartex" xmlns:cx8="http://schemas.microsoft.com/office/drawing/2016/5/14/chartex" xmlns:mc="http://schemas.openxmlformats.org/markup-compatibility/2006" xmlns:aink="http://schemas.microsoft.com/office/drawing/2016/ink" xmlns:am3d="http://schemas.microsoft.com/office/drawing/2017/model3d" xmlns:o="urn:schemas-microsoft-com:office:office" xmlns:r="http://schemas.openxmlformats.org/officeDocument/2006/relationships" xmlns:m="http://schemas.openxmlformats.org/officeDocument/2006/math" xmlns:v="urn:schemas-microsoft-com:vml" xmlns:wp14="http://schemas.microsoft.com/office/word/2010/wordprocessingDrawing" xmlns:wp="http://schemas.openxmlformats.org/drawingml/2006/wordprocessingDrawing" xmlns:w10="urn:schemas-microsoft-com:office:word" xmlns:w="http://schemas.openxmlformats.org/wordprocessingml/2006/main" xmlns:w14="http://schemas.microsoft.com/office/word/2010/wordml" xmlns:w15="http://schemas.microsoft.com/office/word/2012/wordml" xmlns:w16cex="http://schemas.microsoft.com/office/word/2018/wordml/cex" xmlns:w16cid="http://schemas.microsoft.com/office/word/2016/wordml/cid" xmlns:w16="http://schemas.microsoft.com/office/word/2018/wordml" xmlns:w16sdtdh="http://schemas.microsoft.com/office/word/2020/wordml/sdtdatahash" xmlns:w16se="http://schemas.microsoft.com/office/word/2015/wordml/symex" xmlns:wpg="http://schemas.microsoft.com/office/word/2010/wordprocessingGroup" xmlns:wpi="http://schemas.microsoft.com/office/word/2010/wordprocessingInk" xmlns:wne="http://schemas.microsoft.com/office/word/2006/wordml" xmlns:wps="http://schemas.microsoft.com/office/word/2010/wordprocessingShape" mc:Ignorable="w14 w15 w16se w16cid w16 w16cex w16sdtdh wp14">
+<w:numbering xmlns:wpc="http://schemas.microsoft.com/office/word/2010/wordprocessingCanvas" xmlns:cx="http://schemas.microsoft.com/office/drawing/2014/chartex" xmlns:cx1="http://schemas.microsoft.com/office/drawing/2015/9/8/chartex" xmlns:cx2="http://schemas.microsoft.com/office/drawing/2015/10/21/chartex" xmlns:cx3="http://schemas.microsoft.com/office/drawing/2016/5/9/chartex" xmlns:cx4="http://schemas.microsoft.com/office/drawing/2016/5/10/chartex" xmlns:cx5="http://schemas.microsoft.com/office/drawing/2016/5/11/chartex" xmlns:cx6="http://schemas.microsoft.com/office/drawing/2016/5/12/chartex" xmlns:cx7="http://schemas.microsoft.com/office/drawing/2016/5/13/chartex" xmlns:cx8="http://schemas.microsoft.com/office/drawing/2016/5/14/chartex" xmlns:mc="http://schemas.openxmlformats.org/markup-compatibility/2006" xmlns:aink="http://schemas.microsoft.com/office/drawing/2016/ink" xmlns:am3d="http://schemas.microsoft.com/office/drawing/2017/model3d" xmlns:o="urn:schemas-microsoft-com:office:office" xmlns:oel="http://schemas.microsoft.com/office/2019/extlst" xmlns:r="http://schemas.openxmlformats.org/officeDocument/2006/relationships" xmlns:m="http://schemas.openxmlformats.org/officeDocument/2006/math" xmlns:v="urn:schemas-microsoft-com:vml" xmlns:wp14="http://schemas.microsoft.com/office/word/2010/wordprocessingDrawing" xmlns:wp="http://schemas.openxmlformats.org/drawingml/2006/wordprocessingDrawing" xmlns:w10="urn:schemas-microsoft-com:office:word" xmlns:w="http://schemas.openxmlformats.org/wordprocessingml/2006/main" xmlns:w14="http://schemas.microsoft.com/office/word/2010/wordml" xmlns:w15="http://schemas.microsoft.com/office/word/2012/wordml" xmlns:w16cex="http://schemas.microsoft.com/office/word/2018/wordml/cex" xmlns:w16cid="http://schemas.microsoft.com/office/word/2016/wordml/cid" xmlns:w16="http://schemas.microsoft.com/office/word/2018/wordml" xmlns:w16du="http://schemas.microsoft.com/office/word/2023/wordml/word16du" xmlns:w16sdtdh="http://schemas.microsoft.com/office/word/2020/wordml/sdtdatahash" xmlns:w16sdtfl="http://schemas.microsoft.com/office/word/2024/wordml/sdtformatlock" xmlns:w16se="http://schemas.microsoft.com/office/word/2015/wordml/symex" xmlns:wpg="http://schemas.microsoft.com/office/word/2010/wordprocessingGroup" xmlns:wpi="http://schemas.microsoft.com/office/word/2010/wordprocessingInk" xmlns:wne="http://schemas.microsoft.com/office/word/2006/wordml" xmlns:wps="http://schemas.microsoft.com/office/word/2010/wordprocessingShape" mc:Ignorable="w14 w15 w16se w16cid w16 w16cex w16sdtdh w16sdtfl w16du wp14">
   <w:abstractNum w:abstractNumId="0" w15:restartNumberingAfterBreak="0">
     <w:nsid w:val="EA454B4C"/>
     <w:multiLevelType w:val="multilevel"/>
@@ -1662,44 +1818,44 @@
       </w:pPr>
     </w:lvl>
   </w:abstractNum>
-  <w:num w:numId="1">
+  <w:num w:numId="1" w16cid:durableId="1311053939">
     <w:abstractNumId w:val="1"/>
   </w:num>
-  <w:num w:numId="2">
+  <w:num w:numId="2" w16cid:durableId="912549945">
     <w:abstractNumId w:val="1"/>
   </w:num>
-  <w:num w:numId="3">
+  <w:num w:numId="3" w16cid:durableId="183253389">
     <w:abstractNumId w:val="0"/>
   </w:num>
-  <w:num w:numId="4">
+  <w:num w:numId="4" w16cid:durableId="1824811420">
     <w:abstractNumId w:val="0"/>
   </w:num>
-  <w:num w:numId="5">
+  <w:num w:numId="5" w16cid:durableId="59402012">
     <w:abstractNumId w:val="4"/>
   </w:num>
-  <w:num w:numId="6">
+  <w:num w:numId="6" w16cid:durableId="580799439">
     <w:abstractNumId w:val="6"/>
   </w:num>
-  <w:num w:numId="7">
+  <w:num w:numId="7" w16cid:durableId="1749423603">
     <w:abstractNumId w:val="7"/>
   </w:num>
-  <w:num w:numId="8">
+  <w:num w:numId="8" w16cid:durableId="94593779">
     <w:abstractNumId w:val="5"/>
   </w:num>
-  <w:num w:numId="9">
+  <w:num w:numId="9" w16cid:durableId="736057177">
     <w:abstractNumId w:val="7"/>
     <w:lvlOverride w:ilvl="0">
       <w:startOverride w:val="1"/>
     </w:lvlOverride>
   </w:num>
-  <w:num w:numId="10">
+  <w:num w:numId="10" w16cid:durableId="949976449">
     <w:abstractNumId w:val="3"/>
   </w:num>
 </w:numbering>
 </file>
 
 <file path=word/styles.xml><?xml version="1.0" encoding="utf-8"?>
-<w:styles xmlns:mc="http://schemas.openxmlformats.org/markup-compatibility/2006" xmlns:r="http://schemas.openxmlformats.org/officeDocument/2006/relationships" xmlns:w="http://schemas.openxmlformats.org/wordprocessingml/2006/main" xmlns:w14="http://schemas.microsoft.com/office/word/2010/wordml" xmlns:w15="http://schemas.microsoft.com/office/word/2012/wordml" xmlns:w16cex="http://schemas.microsoft.com/office/word/2018/wordml/cex" xmlns:w16cid="http://schemas.microsoft.com/office/word/2016/wordml/cid" xmlns:w16="http://schemas.microsoft.com/office/word/2018/wordml" xmlns:w16sdtdh="http://schemas.microsoft.com/office/word/2020/wordml/sdtdatahash" xmlns:w16se="http://schemas.microsoft.com/office/word/2015/wordml/symex" mc:Ignorable="w14 w15 w16se w16cid w16 w16cex w16sdtdh">
+<w:styles xmlns:mc="http://schemas.openxmlformats.org/markup-compatibility/2006" xmlns:r="http://schemas.openxmlformats.org/officeDocument/2006/relationships" xmlns:w="http://schemas.openxmlformats.org/wordprocessingml/2006/main" xmlns:w14="http://schemas.microsoft.com/office/word/2010/wordml" xmlns:w15="http://schemas.microsoft.com/office/word/2012/wordml" xmlns:w16cex="http://schemas.microsoft.com/office/word/2018/wordml/cex" xmlns:w16cid="http://schemas.microsoft.com/office/word/2016/wordml/cid" xmlns:w16="http://schemas.microsoft.com/office/word/2018/wordml" xmlns:w16du="http://schemas.microsoft.com/office/word/2023/wordml/word16du" xmlns:w16sdtdh="http://schemas.microsoft.com/office/word/2020/wordml/sdtdatahash" xmlns:w16sdtfl="http://schemas.microsoft.com/office/word/2024/wordml/sdtformatlock" xmlns:w16se="http://schemas.microsoft.com/office/word/2015/wordml/symex" mc:Ignorable="w14 w15 w16se w16cid w16 w16cex w16sdtdh w16sdtfl w16du">
   <w:docDefaults>
     <w:rPrDefault>
       <w:rPr>

</xml_diff>